<commit_message>
Add Household and Followup USSD service
</commit_message>
<xml_diff>
--- a/NeoMatCare-User-Manual.docx
+++ b/NeoMatCare-User-Manual.docx
@@ -1728,7 +1728,7 @@
         <w:spacing w:after="160"/>
       </w:pPr>
       <w:r>
-        <w:t xml:space="preserve">Two lightweight actions are available from a basic phone, for when you're doing fieldwork away from the app rather than handling an emergency. Both are keyed by the patient's Hospital ID and don't require the app at all.</w:t>
+        <w:t xml:space="preserve">Several lightweight actions are available from a basic phone, for when you're doing fieldwork away from the app rather than handling an emergency. All are keyed by a patient's Hospital ID and don't require the app at all.</w:t>
       </w:r>
     </w:p>
     <w:p>
@@ -1773,6 +1773,123 @@
       </w:pPr>
       <w:r>
         <w:t xml:space="preserve">Appends a timestamped note to the patient's record, visible to facility staff in the app immediately. On USSD: choose “Log Follow-Up Note,” enter the Hospital ID, then type your note. By SMS: text NOTE &lt;hospital id&gt; &lt;your note&gt; (e.g. “NOTE H12345 Took BP today, 130/85, advised rest”). Each note is saved with your name and the date/time — earlier notes aren't overwritten, they build up as a running log.</w:t>
+      </w:r>
+    </w:p>
+    <w:p>
+      <w:pPr>
+        <w:pStyle w:val="Heading3"/>
+        <w:spacing w:after="100" w:before="200"/>
+      </w:pPr>
+      <w:r>
+        <w:rPr>
+          <w:b/>
+          <w:bCs/>
+          <w:color w:val="334155"/>
+        </w:rPr>
+        <w:t xml:space="preserve">Nutrition Tips for a Patient</w:t>
+      </w:r>
+    </w:p>
+    <w:p>
+      <w:pPr>
+        <w:spacing w:after="160"/>
+      </w:pPr>
+      <w:r>
+        <w:t xml:space="preserve">Pulls the same guidance the app's Nutrition tab shows for that patient — pregnancy-stage, general adult, or child feeding tips, whichever applies. On USSD, reach it through Household Follow-Up below (pick the member, then “Nutrition tips”). By SMS: text NUTRITION &lt;hospital id&gt; (e.g. “NUTRITION H12345”).</w:t>
+      </w:r>
+    </w:p>
+    <w:p>
+      <w:pPr>
+        <w:pStyle w:val="Heading3"/>
+        <w:spacing w:after="100" w:before="200"/>
+      </w:pPr>
+      <w:r>
+        <w:rPr>
+          <w:b/>
+          <w:bCs/>
+          <w:color w:val="334155"/>
+        </w:rPr>
+        <w:t xml:space="preserve">Household Follow-Up</w:t>
+      </w:r>
+    </w:p>
+    <w:p>
+      <w:pPr>
+        <w:spacing w:after="160"/>
+      </w:pPr>
+      <w:r>
+        <w:t xml:space="preserve">Reach an entire household from the field, without needing to know every member's Hospital ID individually:</w:t>
+      </w:r>
+    </w:p>
+    <w:p>
+      <w:pPr>
+        <w:pStyle w:val="ListParagraph"/>
+        <w:numPr>
+          <w:ilvl w:val="0"/>
+          <w:numId w:val="10"/>
+        </w:numPr>
+        <w:spacing w:after="80"/>
+      </w:pPr>
+      <w:r>
+        <w:t xml:space="preserve">Choose “Household Follow-Up” from the USSD main menu.</w:t>
+      </w:r>
+    </w:p>
+    <w:p>
+      <w:pPr>
+        <w:pStyle w:val="ListParagraph"/>
+        <w:numPr>
+          <w:ilvl w:val="0"/>
+          <w:numId w:val="10"/>
+        </w:numPr>
+        <w:spacing w:after="80"/>
+      </w:pPr>
+      <w:r>
+        <w:t xml:space="preserve">Find the household either by any member's Hospital ID, or by searching the head-of-household's name. A name search showing more than five matches will ask you to narrow it — try a Hospital ID instead if that keeps happening.</w:t>
+      </w:r>
+    </w:p>
+    <w:p>
+      <w:pPr>
+        <w:pStyle w:val="ListParagraph"/>
+        <w:numPr>
+          <w:ilvl w:val="0"/>
+          <w:numId w:val="10"/>
+        </w:numPr>
+        <w:spacing w:after="80"/>
+      </w:pPr>
+      <w:r>
+        <w:t xml:space="preserve">You'll see the household's food security status and up to five members listed by name, age, and whether they're a maternal or child record.</w:t>
+      </w:r>
+    </w:p>
+    <w:p>
+      <w:pPr>
+        <w:pStyle w:val="ListParagraph"/>
+        <w:numPr>
+          <w:ilvl w:val="0"/>
+          <w:numId w:val="10"/>
+        </w:numPr>
+        <w:spacing w:after="80"/>
+      </w:pPr>
+      <w:r>
+        <w:t xml:space="preserve">Pick a member, then choose an action: Check status, Log a note, Nutrition tips, or Log a visit.</w:t>
+      </w:r>
+    </w:p>
+    <w:p>
+      <w:pPr>
+        <w:pStyle w:val="ListParagraph"/>
+        <w:numPr>
+          <w:ilvl w:val="0"/>
+          <w:numId w:val="10"/>
+        </w:numPr>
+        <w:spacing w:after="80"/>
+      </w:pPr>
+      <w:r>
+        <w:t xml:space="preserve">Log a visit is deliberately simple — “Visit completed, no concerns” or “Visit completed, has a concern” (with one line describing it). This is a presence-and-flag record, not a replacement for logging real vitals in the app.</w:t>
+      </w:r>
+    </w:p>
+    <w:p>
+      <w:pPr>
+        <w:spacing w:after="160"/>
+      </w:pPr>
+      <w:r>
+        <w:t xml:space="preserve">By SMS, household lookup is Hospital-ID only (no name search, since there's no way to show a numbered pick-list in a single text): HOUSEHOLD &lt;a member's hospital id&gt; replies with the household summary and member list. Logging a visit by SMS: VISIT &lt;hospital id&gt; OK, or VISIT &lt;hospital id&gt; CONCERN &lt;what you noticed&gt;.</w:t>
       </w:r>
     </w:p>
     <w:p>
@@ -1793,7 +1910,7 @@
         <w:t xml:space="preserve">Note: </w:t>
       </w:r>
       <w:r>
-        <w:t xml:space="preserve">Both actions only work for a Hospital ID that's already in NeoMatCare, and only for phone numbers registered to a Health Worker or Facility Admin account. Neither one can change a patient's risk level or referral status — for anything beyond a quick check-in or note, use the app.</w:t>
+        <w:t xml:space="preserve">All of these only work for a Hospital ID (or household) already in NeoMatCare, and only for phone numbers registered to a Health Worker or Facility Admin account. None of them can change a patient's risk level or referral status, and visit logging here is intentionally blunt — for real vitals, ANC details, or growth measurements, use the app.</w:t>
       </w:r>
     </w:p>
     <w:p>
@@ -2100,7 +2217,7 @@
         <w:pStyle w:val="ListParagraph"/>
         <w:numPr>
           <w:ilvl w:val="0"/>
-          <w:numId w:val="10"/>
+          <w:numId w:val="11"/>
         </w:numPr>
         <w:spacing w:after="80"/>
       </w:pPr>
@@ -2113,7 +2230,7 @@
         <w:pStyle w:val="ListParagraph"/>
         <w:numPr>
           <w:ilvl w:val="0"/>
-          <w:numId w:val="10"/>
+          <w:numId w:val="11"/>
         </w:numPr>
         <w:spacing w:after="80"/>
       </w:pPr>
@@ -2126,7 +2243,7 @@
         <w:pStyle w:val="ListParagraph"/>
         <w:numPr>
           <w:ilvl w:val="0"/>
-          <w:numId w:val="10"/>
+          <w:numId w:val="11"/>
         </w:numPr>
         <w:spacing w:after="80"/>
       </w:pPr>
@@ -2139,7 +2256,7 @@
         <w:pStyle w:val="ListParagraph"/>
         <w:numPr>
           <w:ilvl w:val="0"/>
-          <w:numId w:val="10"/>
+          <w:numId w:val="11"/>
         </w:numPr>
         <w:spacing w:after="80"/>
       </w:pPr>
@@ -2152,7 +2269,7 @@
         <w:pStyle w:val="ListParagraph"/>
         <w:numPr>
           <w:ilvl w:val="0"/>
-          <w:numId w:val="10"/>
+          <w:numId w:val="11"/>
         </w:numPr>
         <w:spacing w:after="80"/>
       </w:pPr>
@@ -2351,7 +2468,7 @@
         <w:pStyle w:val="ListParagraph"/>
         <w:numPr>
           <w:ilvl w:val="0"/>
-          <w:numId w:val="11"/>
+          <w:numId w:val="12"/>
         </w:numPr>
         <w:spacing w:after="80"/>
       </w:pPr>
@@ -2364,7 +2481,7 @@
         <w:pStyle w:val="ListParagraph"/>
         <w:numPr>
           <w:ilvl w:val="0"/>
-          <w:numId w:val="11"/>
+          <w:numId w:val="12"/>
         </w:numPr>
         <w:spacing w:after="80"/>
       </w:pPr>
@@ -2377,7 +2494,7 @@
         <w:pStyle w:val="ListParagraph"/>
         <w:numPr>
           <w:ilvl w:val="0"/>
-          <w:numId w:val="11"/>
+          <w:numId w:val="12"/>
         </w:numPr>
         <w:spacing w:after="80"/>
       </w:pPr>
@@ -2390,7 +2507,7 @@
         <w:pStyle w:val="ListParagraph"/>
         <w:numPr>
           <w:ilvl w:val="0"/>
-          <w:numId w:val="11"/>
+          <w:numId w:val="12"/>
         </w:numPr>
         <w:spacing w:after="80"/>
       </w:pPr>
@@ -2625,7 +2742,7 @@
         <w:pStyle w:val="ListParagraph"/>
         <w:numPr>
           <w:ilvl w:val="0"/>
-          <w:numId w:val="12"/>
+          <w:numId w:val="13"/>
         </w:numPr>
         <w:spacing w:after="80"/>
       </w:pPr>
@@ -2638,7 +2755,7 @@
         <w:pStyle w:val="ListParagraph"/>
         <w:numPr>
           <w:ilvl w:val="0"/>
-          <w:numId w:val="12"/>
+          <w:numId w:val="13"/>
         </w:numPr>
         <w:spacing w:after="80"/>
       </w:pPr>
@@ -2651,7 +2768,7 @@
         <w:pStyle w:val="ListParagraph"/>
         <w:numPr>
           <w:ilvl w:val="0"/>
-          <w:numId w:val="12"/>
+          <w:numId w:val="13"/>
         </w:numPr>
         <w:spacing w:after="80"/>
       </w:pPr>
@@ -2761,6 +2878,49 @@
     </w:p>
     <w:p>
       <w:pPr>
+        <w:pStyle w:val="Heading3"/>
+        <w:spacing w:after="100" w:before="200"/>
+      </w:pPr>
+      <w:r>
+        <w:rPr>
+          <w:b/>
+          <w:bCs/>
+          <w:color w:val="334155"/>
+        </w:rPr>
+        <w:t xml:space="preserve">Getting Your Nutrition Tips Without the App</w:t>
+      </w:r>
+    </w:p>
+    <w:p>
+      <w:pPr>
+        <w:spacing w:after="160"/>
+      </w:pPr>
+      <w:r>
+        <w:t xml:space="preserve">If a health worker has your phone number on file, you can get your own nutrition guidance without opening the app at all — useful if you don't have a smartphone or data. Dial the NeoMatCare USSD short code from your own phone (you'll be recognised automatically) and you'll see a short menu: your own guidance, and — if you have a child under five linked to your household — your child's guidance too. By SMS, text NUTRITION to the same number for your own tips, or NUTRITION CHILD if you have one child (add the child's name, e.g. “NUTRITION CHILD Kojo,” if you have more than one).</w:t>
+      </w:r>
+    </w:p>
+    <w:p>
+      <w:pPr>
+        <w:pBdr>
+          <w:left w:val="single" w:color="207652" w:sz="18" w:space="8"/>
+        </w:pBdr>
+        <w:shd w:fill="EAF7F0" w:val="clear"/>
+        <w:spacing w:after="200" w:before="100"/>
+        <w:ind w:left="200"/>
+      </w:pPr>
+      <w:r>
+        <w:rPr>
+          <w:b/>
+          <w:bCs/>
+          <w:color w:val="14532d"/>
+        </w:rPr>
+        <w:t xml:space="preserve">Note: </w:t>
+      </w:r>
+      <w:r>
+        <w:t xml:space="preserve">This only works from the exact phone number a health worker has recorded for you. If dialling or texting says your number isn't recognised, ask your health worker to add or check it on your record.</w:t>
+      </w:r>
+    </w:p>
+    <w:p>
+      <w:pPr>
         <w:pStyle w:val="Heading2"/>
         <w:spacing w:after="150" w:before="300"/>
       </w:pPr>
@@ -2786,7 +2946,7 @@
         <w:pStyle w:val="ListParagraph"/>
         <w:numPr>
           <w:ilvl w:val="0"/>
-          <w:numId w:val="13"/>
+          <w:numId w:val="14"/>
         </w:numPr>
         <w:spacing w:after="80"/>
       </w:pPr>
@@ -2799,7 +2959,7 @@
         <w:pStyle w:val="ListParagraph"/>
         <w:numPr>
           <w:ilvl w:val="0"/>
-          <w:numId w:val="13"/>
+          <w:numId w:val="14"/>
         </w:numPr>
         <w:spacing w:after="80"/>
       </w:pPr>
@@ -2812,7 +2972,7 @@
         <w:pStyle w:val="ListParagraph"/>
         <w:numPr>
           <w:ilvl w:val="0"/>
-          <w:numId w:val="13"/>
+          <w:numId w:val="14"/>
         </w:numPr>
         <w:spacing w:after="80"/>
       </w:pPr>
@@ -2855,7 +3015,7 @@
         <w:pStyle w:val="ListParagraph"/>
         <w:numPr>
           <w:ilvl w:val="0"/>
-          <w:numId w:val="14"/>
+          <w:numId w:val="15"/>
         </w:numPr>
         <w:spacing w:after="80"/>
       </w:pPr>
@@ -2868,7 +3028,7 @@
         <w:pStyle w:val="ListParagraph"/>
         <w:numPr>
           <w:ilvl w:val="0"/>
-          <w:numId w:val="14"/>
+          <w:numId w:val="15"/>
         </w:numPr>
         <w:spacing w:after="80"/>
       </w:pPr>
@@ -2881,7 +3041,7 @@
         <w:pStyle w:val="ListParagraph"/>
         <w:numPr>
           <w:ilvl w:val="0"/>
-          <w:numId w:val="14"/>
+          <w:numId w:val="15"/>
         </w:numPr>
         <w:spacing w:after="80"/>
       </w:pPr>
@@ -2979,7 +3139,7 @@
         <w:pStyle w:val="ListParagraph"/>
         <w:numPr>
           <w:ilvl w:val="0"/>
-          <w:numId w:val="15"/>
+          <w:numId w:val="16"/>
         </w:numPr>
         <w:spacing w:after="80"/>
       </w:pPr>
@@ -2992,7 +3152,7 @@
         <w:pStyle w:val="ListParagraph"/>
         <w:numPr>
           <w:ilvl w:val="0"/>
-          <w:numId w:val="15"/>
+          <w:numId w:val="16"/>
         </w:numPr>
         <w:spacing w:after="80"/>
       </w:pPr>
@@ -3005,7 +3165,7 @@
         <w:pStyle w:val="ListParagraph"/>
         <w:numPr>
           <w:ilvl w:val="0"/>
-          <w:numId w:val="15"/>
+          <w:numId w:val="16"/>
         </w:numPr>
         <w:spacing w:after="80"/>
       </w:pPr>
@@ -3018,7 +3178,7 @@
         <w:pStyle w:val="ListParagraph"/>
         <w:numPr>
           <w:ilvl w:val="0"/>
-          <w:numId w:val="15"/>
+          <w:numId w:val="16"/>
         </w:numPr>
         <w:spacing w:after="80"/>
       </w:pPr>
@@ -3031,7 +3191,7 @@
         <w:pStyle w:val="ListParagraph"/>
         <w:numPr>
           <w:ilvl w:val="0"/>
-          <w:numId w:val="15"/>
+          <w:numId w:val="16"/>
         </w:numPr>
         <w:spacing w:after="80"/>
       </w:pPr>
@@ -3058,7 +3218,7 @@
         <w:pStyle w:val="ListParagraph"/>
         <w:numPr>
           <w:ilvl w:val="0"/>
-          <w:numId w:val="16"/>
+          <w:numId w:val="17"/>
         </w:numPr>
         <w:spacing w:after="80"/>
       </w:pPr>
@@ -3071,7 +3231,7 @@
         <w:pStyle w:val="ListParagraph"/>
         <w:numPr>
           <w:ilvl w:val="0"/>
-          <w:numId w:val="16"/>
+          <w:numId w:val="17"/>
         </w:numPr>
         <w:spacing w:after="80"/>
       </w:pPr>
@@ -3084,7 +3244,7 @@
         <w:pStyle w:val="ListParagraph"/>
         <w:numPr>
           <w:ilvl w:val="0"/>
-          <w:numId w:val="16"/>
+          <w:numId w:val="17"/>
         </w:numPr>
         <w:spacing w:after="80"/>
       </w:pPr>
@@ -3097,7 +3257,7 @@
         <w:pStyle w:val="ListParagraph"/>
         <w:numPr>
           <w:ilvl w:val="0"/>
-          <w:numId w:val="16"/>
+          <w:numId w:val="17"/>
         </w:numPr>
         <w:spacing w:after="80"/>
       </w:pPr>
@@ -3124,7 +3284,7 @@
         <w:pStyle w:val="ListParagraph"/>
         <w:numPr>
           <w:ilvl w:val="0"/>
-          <w:numId w:val="17"/>
+          <w:numId w:val="18"/>
         </w:numPr>
         <w:spacing w:after="80"/>
       </w:pPr>
@@ -3137,7 +3297,7 @@
         <w:pStyle w:val="ListParagraph"/>
         <w:numPr>
           <w:ilvl w:val="0"/>
-          <w:numId w:val="17"/>
+          <w:numId w:val="18"/>
         </w:numPr>
         <w:spacing w:after="80"/>
       </w:pPr>
@@ -3150,7 +3310,7 @@
         <w:pStyle w:val="ListParagraph"/>
         <w:numPr>
           <w:ilvl w:val="0"/>
-          <w:numId w:val="17"/>
+          <w:numId w:val="18"/>
         </w:numPr>
         <w:spacing w:after="80"/>
       </w:pPr>
@@ -3177,7 +3337,7 @@
         <w:pStyle w:val="ListParagraph"/>
         <w:numPr>
           <w:ilvl w:val="0"/>
-          <w:numId w:val="18"/>
+          <w:numId w:val="19"/>
         </w:numPr>
         <w:spacing w:after="80"/>
       </w:pPr>
@@ -3190,7 +3350,7 @@
         <w:pStyle w:val="ListParagraph"/>
         <w:numPr>
           <w:ilvl w:val="0"/>
-          <w:numId w:val="18"/>
+          <w:numId w:val="19"/>
         </w:numPr>
         <w:spacing w:after="80"/>
       </w:pPr>
@@ -3203,7 +3363,7 @@
         <w:pStyle w:val="ListParagraph"/>
         <w:numPr>
           <w:ilvl w:val="0"/>
-          <w:numId w:val="18"/>
+          <w:numId w:val="19"/>
         </w:numPr>
         <w:spacing w:after="80"/>
       </w:pPr>
@@ -3216,7 +3376,7 @@
         <w:pStyle w:val="ListParagraph"/>
         <w:numPr>
           <w:ilvl w:val="0"/>
-          <w:numId w:val="18"/>
+          <w:numId w:val="19"/>
         </w:numPr>
         <w:spacing w:after="80"/>
       </w:pPr>
@@ -3229,7 +3389,7 @@
         <w:pStyle w:val="ListParagraph"/>
         <w:numPr>
           <w:ilvl w:val="0"/>
-          <w:numId w:val="18"/>
+          <w:numId w:val="19"/>
         </w:numPr>
         <w:spacing w:after="80"/>
       </w:pPr>
@@ -5461,6 +5621,27 @@
       </w:pPr>
     </w:lvl>
   </w:abstractNum>
+  <w:abstractNum w:abstractNumId="19" w15:restartNumberingAfterBreak="0">
+    <w:multiLevelType w:val="hybridMultilevel"/>
+    <w:lvl w:ilvl="0" w15:tentative="1">
+      <w:start w:val="1"/>
+      <w:numFmt w:val="decimal"/>
+      <w:lvlText w:val="%1."/>
+      <w:lvlJc w:val="left"/>
+      <w:pPr>
+        <w:ind w:left="480" w:hanging="320"/>
+      </w:pPr>
+    </w:lvl>
+    <w:lvl w:ilvl="1" w15:tentative="1">
+      <w:start w:val="1"/>
+      <w:numFmt w:val="lowerLetter"/>
+      <w:lvlText w:val="%2."/>
+      <w:lvlJc w:val="left"/>
+      <w:pPr>
+        <w:ind w:left="900" w:hanging="320"/>
+      </w:pPr>
+    </w:lvl>
+  </w:abstractNum>
   <w:num w:numId="1">
     <w:abstractNumId w:val="1"/>
     <w:lvlOverride w:ilvl="0">
@@ -5565,6 +5746,12 @@
   </w:num>
   <w:num w:numId="18">
     <w:abstractNumId w:val="18"/>
+    <w:lvlOverride w:ilvl="0">
+      <w:startOverride w:val="1"/>
+    </w:lvlOverride>
+  </w:num>
+  <w:num w:numId="19">
+    <w:abstractNumId w:val="19"/>
     <w:lvlOverride w:ilvl="0">
       <w:startOverride w:val="1"/>
     </w:lvlOverride>

</xml_diff>